<commit_message>
Programme Management: Replace BCP-001 Business Continuity Plan with controlled production version
</commit_message>
<xml_diff>
--- a/tooling/ProgrammeManagement/04 Operations/BCP-001 Business Continuity Plan.docx
+++ b/tooling/ProgrammeManagement/04 Operations/BCP-001 Business Continuity Plan.docx
@@ -4,890 +4,241 @@
   <w:body>
     <w:p>
       <w:pPr>
-        <w:jc w:val="center"/>
+        <w:pStyle w:val="Heading1"/>
       </w:pPr>
       <w:r>
-        <w:rPr>
-          <w:b/>
-          <w:sz w:val="44"/>
-        </w:rPr>
-        <w:t>BCP-001</w:t>
-        <w:br/>
-        <w:t>Business Continuity Plan</w:t>
+        <w:t>BCP-001 Business Continuity Plan</w:t>
       </w:r>
     </w:p>
     <w:p>
       <w:r>
-        <w:t>Repository: tooling\ProgrammeManagement\04 Operations\\</w:t>
+        <w:t>Document ID: BCP-001</w:t>
+        <w:br/>
+        <w:t>Title: Business Continuity Plan</w:t>
+      </w:r>
+    </w:p>
+    <w:p>
+      <w:pPr>
+        <w:pStyle w:val="Heading2"/>
+      </w:pPr>
+      <w:r>
+        <w:t>1. Purpose</w:t>
       </w:r>
     </w:p>
     <w:p>
       <w:r>
-        <w:t>Filename: BCP-001 Business Continuity Plan.docx</w:t>
+        <w:rPr>
+          <w:sz w:val="21"/>
+        </w:rPr>
+        <w:t>Define the framework for maintaining or restoring critical programme operations following disruption.</w:t>
+      </w:r>
+    </w:p>
+    <w:p>
+      <w:pPr>
+        <w:pStyle w:val="Heading2"/>
+      </w:pPr>
+      <w:r>
+        <w:t>2. Scope</w:t>
       </w:r>
     </w:p>
     <w:p>
       <w:r>
-        <w:br w:type="page"/>
+        <w:rPr>
+          <w:sz w:val="21"/>
+        </w:rPr>
+        <w:t>Applies to governance, planning, engineering, operations, delivery, quality, security and supporting programme services.</w:t>
       </w:r>
     </w:p>
     <w:p>
       <w:pPr>
-        <w:pStyle w:val="Heading1"/>
+        <w:pStyle w:val="Heading2"/>
       </w:pPr>
       <w:r>
-        <w:t>Engineering Control Record</w:t>
-      </w:r>
-    </w:p>
-    <w:tbl>
-      <w:tblPr>
-        <w:tblStyle w:val="TableGrid"/>
-        <w:tblW w:type="auto" w:w="0"/>
-        <w:tblLook w:firstColumn="1" w:firstRow="1" w:lastColumn="0" w:lastRow="0" w:noHBand="0" w:noVBand="1" w:val="04A0"/>
-      </w:tblPr>
-      <w:tblGrid>
-        <w:gridCol w:w="4320"/>
-        <w:gridCol w:w="4320"/>
-      </w:tblGrid>
-      <w:tr>
-        <w:tc>
-          <w:tcPr>
-            <w:tcW w:type="dxa" w:w="4320"/>
-          </w:tcPr>
-          <w:p>
-            <w:r>
-              <w:t>Field</w:t>
-            </w:r>
-          </w:p>
-        </w:tc>
-        <w:tc>
-          <w:tcPr>
-            <w:tcW w:type="dxa" w:w="4320"/>
-          </w:tcPr>
-          <w:p>
-            <w:r>
-              <w:t>Value</w:t>
-            </w:r>
-          </w:p>
-        </w:tc>
-      </w:tr>
-      <w:tr>
-        <w:tc>
-          <w:tcPr>
-            <w:tcW w:type="dxa" w:w="4320"/>
-          </w:tcPr>
-          <w:p>
-            <w:r>
-              <w:t>Document ID</w:t>
-            </w:r>
-          </w:p>
-        </w:tc>
-        <w:tc>
-          <w:tcPr>
-            <w:tcW w:type="dxa" w:w="4320"/>
-          </w:tcPr>
-          <w:p>
-            <w:r>
-              <w:t>BCP-001</w:t>
-            </w:r>
-          </w:p>
-        </w:tc>
-      </w:tr>
-      <w:tr>
-        <w:tc>
-          <w:tcPr>
-            <w:tcW w:type="dxa" w:w="4320"/>
-          </w:tcPr>
-          <w:p>
-            <w:r>
-              <w:t>Title</w:t>
-            </w:r>
-          </w:p>
-        </w:tc>
-        <w:tc>
-          <w:tcPr>
-            <w:tcW w:type="dxa" w:w="4320"/>
-          </w:tcPr>
-          <w:p>
-            <w:r>
-              <w:t>Business Continuity Plan</w:t>
-            </w:r>
-          </w:p>
-        </w:tc>
-      </w:tr>
-      <w:tr>
-        <w:tc>
-          <w:tcPr>
-            <w:tcW w:type="dxa" w:w="4320"/>
-          </w:tcPr>
-          <w:p>
-            <w:r>
-              <w:t>Status</w:t>
-            </w:r>
-          </w:p>
-        </w:tc>
-        <w:tc>
-          <w:tcPr>
-            <w:tcW w:type="dxa" w:w="4320"/>
-          </w:tcPr>
-          <w:p>
-            <w:r>
-              <w:t>CONTROLLED</w:t>
-            </w:r>
-          </w:p>
-        </w:tc>
-      </w:tr>
-      <w:tr>
-        <w:tc>
-          <w:tcPr>
-            <w:tcW w:type="dxa" w:w="4320"/>
-          </w:tcPr>
-          <w:p>
-            <w:r>
-              <w:t>Version</w:t>
-            </w:r>
-          </w:p>
-        </w:tc>
-        <w:tc>
-          <w:tcPr>
-            <w:tcW w:type="dxa" w:w="4320"/>
-          </w:tcPr>
-          <w:p>
-            <w:r>
-              <w:t>1.0</w:t>
-            </w:r>
-          </w:p>
-        </w:tc>
-      </w:tr>
-      <w:tr>
-        <w:tc>
-          <w:tcPr>
-            <w:tcW w:type="dxa" w:w="4320"/>
-          </w:tcPr>
-          <w:p>
-            <w:r>
-              <w:t>Owner</w:t>
-            </w:r>
-          </w:p>
-        </w:tc>
-        <w:tc>
-          <w:tcPr>
-            <w:tcW w:type="dxa" w:w="4320"/>
-          </w:tcPr>
-          <w:p>
-            <w:r>
-              <w:t>Programme Office</w:t>
-            </w:r>
-          </w:p>
-        </w:tc>
-      </w:tr>
-      <w:tr>
-        <w:tc>
-          <w:tcPr>
-            <w:tcW w:type="dxa" w:w="4320"/>
-          </w:tcPr>
-          <w:p>
-            <w:r>
-              <w:t>Repository Path</w:t>
-            </w:r>
-          </w:p>
-        </w:tc>
-        <w:tc>
-          <w:tcPr>
-            <w:tcW w:type="dxa" w:w="4320"/>
-          </w:tcPr>
-          <w:p>
-            <w:r>
-              <w:t>tooling\ProgrammeManagement\04 Operations\\</w:t>
-            </w:r>
-          </w:p>
-        </w:tc>
-      </w:tr>
-      <w:tr>
-        <w:tc>
-          <w:tcPr>
-            <w:tcW w:type="dxa" w:w="4320"/>
-          </w:tcPr>
-          <w:p>
-            <w:r>
-              <w:t>Filename</w:t>
-            </w:r>
-          </w:p>
-        </w:tc>
-        <w:tc>
-          <w:tcPr>
-            <w:tcW w:type="dxa" w:w="4320"/>
-          </w:tcPr>
-          <w:p>
-            <w:r>
-              <w:t>BCP-001 Business Continuity Plan.docx</w:t>
-            </w:r>
-          </w:p>
-        </w:tc>
-      </w:tr>
-      <w:tr>
-        <w:tc>
-          <w:tcPr>
-            <w:tcW w:type="dxa" w:w="4320"/>
-          </w:tcPr>
-          <w:p>
-            <w:r>
-              <w:t>Baseline</w:t>
-            </w:r>
-          </w:p>
-        </w:tc>
-        <w:tc>
-          <w:tcPr>
-            <w:tcW w:type="dxa" w:w="4320"/>
-          </w:tcPr>
-          <w:p>
-            <w:r>
-              <w:t>FOUNDATION_ENGINEERING_WORKFLOW_v1</w:t>
-            </w:r>
-          </w:p>
-        </w:tc>
-      </w:tr>
-      <w:tr>
-        <w:tc>
-          <w:tcPr>
-            <w:tcW w:type="dxa" w:w="4320"/>
-          </w:tcPr>
-          <w:p>
-            <w:r>
-              <w:t>Last Updated</w:t>
-            </w:r>
-          </w:p>
-        </w:tc>
-        <w:tc>
-          <w:tcPr>
-            <w:tcW w:type="dxa" w:w="4320"/>
-          </w:tcPr>
-          <w:p>
-            <w:r/>
-          </w:p>
-        </w:tc>
-      </w:tr>
-      <w:tr>
-        <w:tc>
-          <w:tcPr>
-            <w:tcW w:type="dxa" w:w="4320"/>
-          </w:tcPr>
-          <w:p>
-            <w:r>
-              <w:t>Next Review</w:t>
-            </w:r>
-          </w:p>
-        </w:tc>
-        <w:tc>
-          <w:tcPr>
-            <w:tcW w:type="dxa" w:w="4320"/>
-          </w:tcPr>
-          <w:p>
-            <w:r/>
-          </w:p>
-        </w:tc>
-      </w:tr>
-    </w:tbl>
-    <w:p>
-      <w:pPr>
-        <w:pStyle w:val="Heading1"/>
-      </w:pPr>
-      <w:r>
-        <w:t>Revision History</w:t>
-      </w:r>
-    </w:p>
-    <w:tbl>
-      <w:tblPr>
-        <w:tblStyle w:val="TableGrid"/>
-        <w:tblW w:type="auto" w:w="0"/>
-        <w:tblLook w:firstColumn="1" w:firstRow="1" w:lastColumn="0" w:lastRow="0" w:noHBand="0" w:noVBand="1" w:val="04A0"/>
-      </w:tblPr>
-      <w:tblGrid>
-        <w:gridCol w:w="1728"/>
-        <w:gridCol w:w="1728"/>
-        <w:gridCol w:w="1728"/>
-        <w:gridCol w:w="1728"/>
-        <w:gridCol w:w="1728"/>
-      </w:tblGrid>
-      <w:tr>
-        <w:tc>
-          <w:tcPr>
-            <w:tcW w:type="dxa" w:w="1728"/>
-          </w:tcPr>
-          <w:p>
-            <w:r>
-              <w:t>Version</w:t>
-            </w:r>
-          </w:p>
-        </w:tc>
-        <w:tc>
-          <w:tcPr>
-            <w:tcW w:type="dxa" w:w="1728"/>
-          </w:tcPr>
-          <w:p>
-            <w:r>
-              <w:t>Date</w:t>
-            </w:r>
-          </w:p>
-        </w:tc>
-        <w:tc>
-          <w:tcPr>
-            <w:tcW w:type="dxa" w:w="1728"/>
-          </w:tcPr>
-          <w:p>
-            <w:r>
-              <w:t>Author</w:t>
-            </w:r>
-          </w:p>
-        </w:tc>
-        <w:tc>
-          <w:tcPr>
-            <w:tcW w:type="dxa" w:w="1728"/>
-          </w:tcPr>
-          <w:p>
-            <w:r>
-              <w:t>Change</w:t>
-            </w:r>
-          </w:p>
-        </w:tc>
-        <w:tc>
-          <w:tcPr>
-            <w:tcW w:type="dxa" w:w="1728"/>
-          </w:tcPr>
-          <w:p>
-            <w:r>
-              <w:t>Status</w:t>
-            </w:r>
-          </w:p>
-        </w:tc>
-      </w:tr>
-      <w:tr>
-        <w:tc>
-          <w:tcPr>
-            <w:tcW w:type="dxa" w:w="1728"/>
-          </w:tcPr>
-          <w:p>
-            <w:r>
-              <w:t>1.0</w:t>
-            </w:r>
-          </w:p>
-        </w:tc>
-        <w:tc>
-          <w:tcPr>
-            <w:tcW w:type="dxa" w:w="1728"/>
-          </w:tcPr>
-          <w:p>
-            <w:r/>
-          </w:p>
-        </w:tc>
-        <w:tc>
-          <w:tcPr>
-            <w:tcW w:type="dxa" w:w="1728"/>
-          </w:tcPr>
-          <w:p>
-            <w:r>
-              <w:t>Programme Office</w:t>
-            </w:r>
-          </w:p>
-        </w:tc>
-        <w:tc>
-          <w:tcPr>
-            <w:tcW w:type="dxa" w:w="1728"/>
-          </w:tcPr>
-          <w:p>
-            <w:r>
-              <w:t>Initial Issue</w:t>
-            </w:r>
-          </w:p>
-        </w:tc>
-        <w:tc>
-          <w:tcPr>
-            <w:tcW w:type="dxa" w:w="1728"/>
-          </w:tcPr>
-          <w:p>
-            <w:r>
-              <w:t>CONTROLLED</w:t>
-            </w:r>
-          </w:p>
-        </w:tc>
-      </w:tr>
-    </w:tbl>
-    <w:p>
-      <w:pPr>
-        <w:pStyle w:val="Heading1"/>
-      </w:pPr>
-      <w:r>
-        <w:t>Table of Contents</w:t>
+        <w:t>3. Business Continuity Objectives</w:t>
       </w:r>
     </w:p>
     <w:p>
       <w:r>
-        <w:t>1. Cover Page</w:t>
+        <w:rPr>
+          <w:sz w:val="21"/>
+        </w:rPr>
+        <w:t>Protect critical functions, minimise disruption, enable recovery and support continual improvement.</w:t>
+      </w:r>
+    </w:p>
+    <w:p>
+      <w:pPr>
+        <w:pStyle w:val="Heading2"/>
+      </w:pPr>
+      <w:r>
+        <w:t>4. Continuity Principles</w:t>
       </w:r>
     </w:p>
     <w:p>
       <w:r>
-        <w:t>2. Engineering Control Record</w:t>
+        <w:rPr>
+          <w:sz w:val="21"/>
+        </w:rPr>
+        <w:t>Preparedness, resilience, prioritisation, accountability, communication, evidence-based response and continual improvement.</w:t>
+      </w:r>
+    </w:p>
+    <w:p>
+      <w:pPr>
+        <w:pStyle w:val="Heading2"/>
+      </w:pPr>
+      <w:r>
+        <w:t>5. Critical Programme Functions</w:t>
       </w:r>
     </w:p>
     <w:p>
       <w:r>
-        <w:t>3. Revision History</w:t>
+        <w:rPr>
+          <w:sz w:val="21"/>
+        </w:rPr>
+        <w:t>Identify essential governance, engineering, operational and support functions requiring continuity arrangements.</w:t>
+      </w:r>
+    </w:p>
+    <w:p>
+      <w:pPr>
+        <w:pStyle w:val="Heading2"/>
+      </w:pPr>
+      <w:r>
+        <w:t>6. Business Impact Assessment</w:t>
       </w:r>
     </w:p>
     <w:p>
       <w:r>
-        <w:t>4. Table of Contents</w:t>
+        <w:rPr>
+          <w:sz w:val="21"/>
+        </w:rPr>
+        <w:t>Assess operational impacts, priorities, dependencies and recovery objectives.</w:t>
+      </w:r>
+    </w:p>
+    <w:p>
+      <w:pPr>
+        <w:pStyle w:val="Heading2"/>
+      </w:pPr>
+      <w:r>
+        <w:t>7. Roles and Responsibilities</w:t>
       </w:r>
     </w:p>
     <w:p>
       <w:r>
-        <w:t>5. Purpose</w:t>
+        <w:rPr>
+          <w:sz w:val="21"/>
+        </w:rPr>
+        <w:t>Define responsibilities for the Programme Office, continuity coordinator, functional owners and supporting teams.</w:t>
+      </w:r>
+    </w:p>
+    <w:p>
+      <w:pPr>
+        <w:pStyle w:val="Heading2"/>
+      </w:pPr>
+      <w:r>
+        <w:t>8. Continuity Response Procedures</w:t>
       </w:r>
     </w:p>
     <w:p>
       <w:r>
-        <w:t>6. Scope</w:t>
+        <w:rPr>
+          <w:sz w:val="21"/>
+        </w:rPr>
+        <w:t>Describe activation, response, prioritisation, recovery coordination and transition to normal operations.</w:t>
+      </w:r>
+    </w:p>
+    <w:p>
+      <w:pPr>
+        <w:pStyle w:val="Heading2"/>
+      </w:pPr>
+      <w:r>
+        <w:t>9. Communication and Escalation</w:t>
       </w:r>
     </w:p>
     <w:p>
       <w:r>
-        <w:t>7. Business Continuity Principles</w:t>
+        <w:rPr>
+          <w:sz w:val="21"/>
+        </w:rPr>
+        <w:t>Define communication channels, stakeholder notifications, governance reporting and escalation.</w:t>
+      </w:r>
+    </w:p>
+    <w:p>
+      <w:pPr>
+        <w:pStyle w:val="Heading2"/>
+      </w:pPr>
+      <w:r>
+        <w:t>10. Resource Requirements</w:t>
       </w:r>
     </w:p>
     <w:p>
       <w:r>
-        <w:t>8. Business Impact Assessment</w:t>
+        <w:rPr>
+          <w:sz w:val="21"/>
+        </w:rPr>
+        <w:t>Identify essential personnel, facilities, systems, suppliers and information resources.</w:t>
+      </w:r>
+    </w:p>
+    <w:p>
+      <w:pPr>
+        <w:pStyle w:val="Heading2"/>
+      </w:pPr>
+      <w:r>
+        <w:t>11. Continuity Testing and Exercising</w:t>
       </w:r>
     </w:p>
     <w:p>
       <w:r>
-        <w:t>9. Continuity Roles and Responsibilities</w:t>
+        <w:rPr>
+          <w:sz w:val="21"/>
+        </w:rPr>
+        <w:t>Conduct planned exercises, evaluate outcomes and implement improvements.</w:t>
+      </w:r>
+    </w:p>
+    <w:p>
+      <w:pPr>
+        <w:pStyle w:val="Heading2"/>
+      </w:pPr>
+      <w:r>
+        <w:t>12. Plan Maintenance</w:t>
       </w:r>
     </w:p>
     <w:p>
       <w:r>
-        <w:t>10. Continuity Strategies</w:t>
+        <w:rPr>
+          <w:sz w:val="21"/>
+        </w:rPr>
+        <w:t>Review after exercises, significant changes or disruptive events under document control.</w:t>
+      </w:r>
+    </w:p>
+    <w:p>
+      <w:pPr>
+        <w:pStyle w:val="Heading2"/>
+      </w:pPr>
+      <w:r>
+        <w:t>13. Related Documents</w:t>
       </w:r>
     </w:p>
     <w:p>
       <w:r>
-        <w:t>11. Incident Response</w:t>
+        <w:rPr>
+          <w:sz w:val="21"/>
+        </w:rPr>
+        <w:t>Reference OPS-001 Operations Manual; DRP-001 Disaster Recovery Plan; GOV-001 Governance Management Manual; STR-001 Programme Strategy; Programme Management Foundation; Quality Management System; Security Management System.</w:t>
+      </w:r>
+    </w:p>
+    <w:p>
+      <w:pPr>
+        <w:pStyle w:val="Heading2"/>
+      </w:pPr>
+      <w:r>
+        <w:t>14. Document Control</w:t>
       </w:r>
     </w:p>
     <w:p>
       <w:r>
-        <w:t>12. Continuity Communications</w:t>
-      </w:r>
-    </w:p>
-    <w:p>
-      <w:r>
-        <w:t>13. Resource Requirements</w:t>
-      </w:r>
-    </w:p>
-    <w:p>
-      <w:r>
-        <w:t>14. Continuity Testing</w:t>
-      </w:r>
-    </w:p>
-    <w:p>
-      <w:r>
-        <w:t>15. Plan Maintenance</w:t>
-      </w:r>
-    </w:p>
-    <w:p>
-      <w:r>
-        <w:t>16. Related Documents</w:t>
-      </w:r>
-    </w:p>
-    <w:p>
-      <w:r>
-        <w:t>17. Appendices</w:t>
-      </w:r>
-    </w:p>
-    <w:p>
-      <w:pPr>
-        <w:pStyle w:val="Heading1"/>
-      </w:pPr>
-      <w:r>
-        <w:t>Purpose</w:t>
-      </w:r>
-    </w:p>
-    <w:p>
-      <w:r>
-        <w:t>Define the controlled process for maintaining critical programme operations during disruptive events.</w:t>
-      </w:r>
-    </w:p>
-    <w:p>
-      <w:pPr>
-        <w:pStyle w:val="Heading1"/>
-      </w:pPr>
-      <w:r>
-        <w:t>Scope</w:t>
-      </w:r>
-    </w:p>
-    <w:p>
-      <w:r>
-        <w:t>Applies to governance, engineering operations, platform operations, suppliers, cloud services, repositories, operational facilities, documentation and supporting business functions.</w:t>
-      </w:r>
-    </w:p>
-    <w:p>
-      <w:pPr>
-        <w:pStyle w:val="Heading1"/>
-      </w:pPr>
-      <w:r>
-        <w:t>Business Continuity Principles</w:t>
-      </w:r>
-    </w:p>
-    <w:p>
-      <w:pPr>
-        <w:pStyle w:val="ListBullet"/>
-      </w:pPr>
-      <w:r>
-        <w:t>Safety First</w:t>
-      </w:r>
-    </w:p>
-    <w:p>
-      <w:pPr>
-        <w:pStyle w:val="ListBullet"/>
-      </w:pPr>
-      <w:r>
-        <w:t>Maintain Critical Operations</w:t>
-      </w:r>
-    </w:p>
-    <w:p>
-      <w:pPr>
-        <w:pStyle w:val="ListBullet"/>
-      </w:pPr>
-      <w:r>
-        <w:t>Controlled Decision Making</w:t>
-      </w:r>
-    </w:p>
-    <w:p>
-      <w:pPr>
-        <w:pStyle w:val="ListBullet"/>
-      </w:pPr>
-      <w:r>
-        <w:t>Clear Communications</w:t>
-      </w:r>
-    </w:p>
-    <w:p>
-      <w:pPr>
-        <w:pStyle w:val="ListBullet"/>
-      </w:pPr>
-      <w:r>
-        <w:t>Continuous Improvement</w:t>
-      </w:r>
-    </w:p>
-    <w:p>
-      <w:pPr>
-        <w:pStyle w:val="Heading1"/>
-      </w:pPr>
-      <w:r>
-        <w:t>Business Impact Assessment</w:t>
-      </w:r>
-    </w:p>
-    <w:p>
-      <w:r>
-        <w:t>Identify critical business activities, determine acceptable downtime, establish operational priorities and assess recovery dependencies.</w:t>
-      </w:r>
-    </w:p>
-    <w:p>
-      <w:pPr>
-        <w:pStyle w:val="Heading1"/>
-      </w:pPr>
-      <w:r>
-        <w:t>Continuity Roles and Responsibilities</w:t>
-      </w:r>
-    </w:p>
-    <w:tbl>
-      <w:tblPr>
-        <w:tblStyle w:val="TableGrid"/>
-        <w:tblW w:type="auto" w:w="0"/>
-        <w:tblLook w:firstColumn="1" w:firstRow="1" w:lastColumn="0" w:lastRow="0" w:noHBand="0" w:noVBand="1" w:val="04A0"/>
-      </w:tblPr>
-      <w:tblGrid>
-        <w:gridCol w:w="4320"/>
-        <w:gridCol w:w="4320"/>
-      </w:tblGrid>
-      <w:tr>
-        <w:tc>
-          <w:tcPr>
-            <w:tcW w:type="dxa" w:w="4320"/>
-          </w:tcPr>
-          <w:p>
-            <w:r>
-              <w:t>Role</w:t>
-            </w:r>
-          </w:p>
-        </w:tc>
-        <w:tc>
-          <w:tcPr>
-            <w:tcW w:type="dxa" w:w="4320"/>
-          </w:tcPr>
-          <w:p>
-            <w:r>
-              <w:t>Responsibility</w:t>
-            </w:r>
-          </w:p>
-        </w:tc>
-      </w:tr>
-      <w:tr>
-        <w:tc>
-          <w:tcPr>
-            <w:tcW w:type="dxa" w:w="4320"/>
-          </w:tcPr>
-          <w:p>
-            <w:r>
-              <w:t>Programme Office</w:t>
-            </w:r>
-          </w:p>
-        </w:tc>
-        <w:tc>
-          <w:tcPr>
-            <w:tcW w:type="dxa" w:w="4320"/>
-          </w:tcPr>
-          <w:p>
-            <w:r>
-              <w:t>Govern continuity activities and programme coordination.</w:t>
-            </w:r>
-          </w:p>
-        </w:tc>
-      </w:tr>
-      <w:tr>
-        <w:tc>
-          <w:tcPr>
-            <w:tcW w:type="dxa" w:w="4320"/>
-          </w:tcPr>
-          <w:p>
-            <w:r>
-              <w:t>Engineering Operations</w:t>
-            </w:r>
-          </w:p>
-        </w:tc>
-        <w:tc>
-          <w:tcPr>
-            <w:tcW w:type="dxa" w:w="4320"/>
-          </w:tcPr>
-          <w:p>
-            <w:r>
-              <w:t>Maintain engineering capability and recovery support.</w:t>
-            </w:r>
-          </w:p>
-        </w:tc>
-      </w:tr>
-      <w:tr>
-        <w:tc>
-          <w:tcPr>
-            <w:tcW w:type="dxa" w:w="4320"/>
-          </w:tcPr>
-          <w:p>
-            <w:r>
-              <w:t>Platform Operations</w:t>
-            </w:r>
-          </w:p>
-        </w:tc>
-        <w:tc>
-          <w:tcPr>
-            <w:tcW w:type="dxa" w:w="4320"/>
-          </w:tcPr>
-          <w:p>
-            <w:r>
-              <w:t>Sustain platform services and operational infrastructure.</w:t>
-            </w:r>
-          </w:p>
-        </w:tc>
-      </w:tr>
-      <w:tr>
-        <w:tc>
-          <w:tcPr>
-            <w:tcW w:type="dxa" w:w="4320"/>
-          </w:tcPr>
-          <w:p>
-            <w:r>
-              <w:t>Security</w:t>
-            </w:r>
-          </w:p>
-        </w:tc>
-        <w:tc>
-          <w:tcPr>
-            <w:tcW w:type="dxa" w:w="4320"/>
-          </w:tcPr>
-          <w:p>
-            <w:r>
-              <w:t>Coordinate security oversight during continuity events.</w:t>
-            </w:r>
-          </w:p>
-        </w:tc>
-      </w:tr>
-      <w:tr>
-        <w:tc>
-          <w:tcPr>
-            <w:tcW w:type="dxa" w:w="4320"/>
-          </w:tcPr>
-          <w:p>
-            <w:r>
-              <w:t>Business Continuity Coordinator</w:t>
-            </w:r>
-          </w:p>
-        </w:tc>
-        <w:tc>
-          <w:tcPr>
-            <w:tcW w:type="dxa" w:w="4320"/>
-          </w:tcPr>
-          <w:p>
-            <w:r>
-              <w:t>Coordinate continuity activation, monitoring and reporting.</w:t>
-            </w:r>
-          </w:p>
-        </w:tc>
-      </w:tr>
-    </w:tbl>
-    <w:p>
-      <w:pPr>
-        <w:pStyle w:val="Heading1"/>
-      </w:pPr>
-      <w:r>
-        <w:t>Continuity Strategies</w:t>
-      </w:r>
-    </w:p>
-    <w:p>
-      <w:r>
-        <w:t>Maintain essential programme functions through documented procedures, protection of critical information, alternative operational arrangements and coordinated engagement with external suppliers.</w:t>
-      </w:r>
-    </w:p>
-    <w:p>
-      <w:pPr>
-        <w:pStyle w:val="Heading1"/>
-      </w:pPr>
-      <w:r>
-        <w:t>Incident Response</w:t>
-      </w:r>
-    </w:p>
-    <w:p>
-      <w:r>
-        <w:t>Manage the transition from incident detection through continuity activation, sustained operations and controlled return to normal business.</w:t>
-      </w:r>
-    </w:p>
-    <w:p>
-      <w:pPr>
-        <w:pStyle w:val="Heading1"/>
-      </w:pPr>
-      <w:r>
-        <w:t>Continuity Communications</w:t>
-      </w:r>
-    </w:p>
-    <w:p>
-      <w:r>
-        <w:t>Maintain timely internal and external communications with stakeholders throughout continuity events.</w:t>
-      </w:r>
-    </w:p>
-    <w:p>
-      <w:pPr>
-        <w:pStyle w:val="Heading1"/>
-      </w:pPr>
-      <w:r>
-        <w:t>Resource Requirements</w:t>
-      </w:r>
-    </w:p>
-    <w:p>
-      <w:r>
-        <w:t>Ensure availability of personnel, facilities, technology, documentation and supplier resources required to sustain programme operations.</w:t>
-      </w:r>
-    </w:p>
-    <w:p>
-      <w:pPr>
-        <w:pStyle w:val="Heading1"/>
-      </w:pPr>
-      <w:r>
-        <w:t>Continuity Testing</w:t>
-      </w:r>
-    </w:p>
-    <w:p>
-      <w:r>
-        <w:t>Conduct scheduled business continuity exercises, validate outcomes, capture lessons learned and track improvement actions.</w:t>
-      </w:r>
-    </w:p>
-    <w:p>
-      <w:pPr>
-        <w:pStyle w:val="Heading1"/>
-      </w:pPr>
-      <w:r>
-        <w:t>Plan Maintenance</w:t>
-      </w:r>
-    </w:p>
-    <w:p>
-      <w:r>
-        <w:t>Review, update and maintain this plan through controlled engineering change and periodic governance review.</w:t>
-      </w:r>
-    </w:p>
-    <w:p>
-      <w:pPr>
-        <w:pStyle w:val="Heading1"/>
-      </w:pPr>
-      <w:r>
-        <w:t>Related Documents</w:t>
-      </w:r>
-    </w:p>
-    <w:p>
-      <w:pPr>
-        <w:pStyle w:val="ListBullet"/>
-      </w:pPr>
-      <w:r>
-        <w:t>Engineering Policies</w:t>
-      </w:r>
-    </w:p>
-    <w:p>
-      <w:pPr>
-        <w:pStyle w:val="ListBullet"/>
-      </w:pPr>
-      <w:r>
-        <w:t>Operations Manual</w:t>
-      </w:r>
-    </w:p>
-    <w:p>
-      <w:pPr>
-        <w:pStyle w:val="ListBullet"/>
-      </w:pPr>
-      <w:r>
-        <w:t>Disaster Recovery Plan</w:t>
-      </w:r>
-    </w:p>
-    <w:p>
-      <w:pPr>
-        <w:pStyle w:val="ListBullet"/>
-      </w:pPr>
-      <w:r>
-        <w:t>Risk Register</w:t>
-      </w:r>
-    </w:p>
-    <w:p>
-      <w:pPr>
-        <w:pStyle w:val="ListBullet"/>
-      </w:pPr>
-      <w:r>
-        <w:t>SPOF Register</w:t>
-      </w:r>
-    </w:p>
-    <w:p>
-      <w:pPr>
-        <w:pStyle w:val="ListBullet"/>
-      </w:pPr>
-      <w:r>
-        <w:t>Recovery Validation Register</w:t>
-      </w:r>
-    </w:p>
-    <w:p>
-      <w:pPr>
-        <w:pStyle w:val="Heading1"/>
-      </w:pPr>
-      <w:r>
-        <w:t>Appendices</w:t>
-      </w:r>
-    </w:p>
-    <w:p>
-      <w:r>
-        <w:t>None.</w:t>
+        <w:rPr>
+          <w:sz w:val="21"/>
+        </w:rPr>
+        <w:t>Maintain approval, review, revision history and controlled distribution.</w:t>
       </w:r>
     </w:p>
     <w:sectPr>

</xml_diff>